<commit_message>
Finale Vorlage TechBF DC: einheitlicher Platzhalter-Standard, keine Splits
</commit_message>
<xml_diff>
--- a/AMBA_VertragTechBetriebsfuehrung_DC - Vorlage.docx
+++ b/AMBA_VertragTechBetriebsfuehrung_DC - Vorlage.docx
@@ -72,7 +72,6 @@
           <w:color w:val="auto"/>
         </w:rPr>
       </w:pPr>
-      <w:proofErr w:type="spellStart"/>
       <w:r>
         <w:rPr>
           <w:rFonts w:ascii="Barlow" w:hAnsi="Barlow"/>
@@ -80,29 +79,8 @@
           <w:bCs/>
           <w:color w:val="auto"/>
         </w:rPr>
-        <w:t>amba</w:t>
-      </w:r>
-      <w:proofErr w:type="spellEnd"/>
-      <w:r>
-        <w:rPr>
-          <w:rFonts w:ascii="Barlow" w:hAnsi="Barlow"/>
-          <w:b/>
-          <w:bCs/>
-          <w:color w:val="auto"/>
-        </w:rPr>
-        <w:t xml:space="preserve"> </w:t>
-      </w:r>
-      <w:proofErr w:type="spellStart"/>
-      <w:r>
-        <w:rPr>
-          <w:rFonts w:ascii="Barlow" w:hAnsi="Barlow"/>
-          <w:b/>
-          <w:bCs/>
-          <w:color w:val="auto"/>
-        </w:rPr>
-        <w:t>operations</w:t>
-      </w:r>
-      <w:proofErr w:type="spellEnd"/>
+        <w:t>amba operations</w:t>
+      </w:r>
       <w:r>
         <w:rPr>
           <w:rFonts w:ascii="Barlow" w:hAnsi="Barlow"/>
@@ -1034,23 +1012,7 @@
           <w:rFonts w:ascii="Barlow" w:hAnsi="Barlow"/>
           <w:color w:val="auto"/>
         </w:rPr>
-        <w:t>und IEC 61851-23 (bei DC-</w:t>
-      </w:r>
-      <w:proofErr w:type="spellStart"/>
-      <w:r>
-        <w:rPr>
-          <w:rFonts w:ascii="Barlow" w:hAnsi="Barlow"/>
-          <w:color w:val="auto"/>
-        </w:rPr>
-        <w:t>Chargern</w:t>
-      </w:r>
-      <w:proofErr w:type="spellEnd"/>
-      <w:r>
-        <w:rPr>
-          <w:rFonts w:ascii="Barlow" w:hAnsi="Barlow"/>
-          <w:color w:val="auto"/>
-        </w:rPr>
-        <w:t xml:space="preserve">) </w:t>
+        <w:t xml:space="preserve">und IEC 61851-23 (bei DC-Chargern) </w:t>
       </w:r>
       <w:r>
         <w:rPr>
@@ -1628,23 +1590,7 @@
           <w:rFonts w:ascii="Barlow" w:hAnsi="Barlow"/>
           <w:color w:val="auto"/>
         </w:rPr>
-        <w:t>3.6     Der Auftragnehmer überwacht die Ladeinfrastruktur via Backend proaktiv und nimmt Remote-</w:t>
-      </w:r>
-      <w:proofErr w:type="spellStart"/>
-      <w:r>
-        <w:rPr>
-          <w:rFonts w:ascii="Barlow" w:hAnsi="Barlow"/>
-          <w:color w:val="auto"/>
-        </w:rPr>
-        <w:t>Entstörungen</w:t>
-      </w:r>
-      <w:proofErr w:type="spellEnd"/>
-      <w:r>
-        <w:rPr>
-          <w:rFonts w:ascii="Barlow" w:hAnsi="Barlow"/>
-          <w:color w:val="auto"/>
-        </w:rPr>
-        <w:t xml:space="preserve"> selbstständig vor. </w:t>
+        <w:t xml:space="preserve">3.6     Der Auftragnehmer überwacht die Ladeinfrastruktur via Backend proaktiv und nimmt Remote-Entstörungen selbstständig vor. </w:t>
       </w:r>
     </w:p>
     <w:p>
@@ -1814,23 +1760,7 @@
           <w:rFonts w:ascii="Barlow" w:hAnsi="Barlow"/>
           <w:color w:val="auto"/>
         </w:rPr>
-        <w:t xml:space="preserve">, oder in jedem Fall durch ein in ein </w:t>
-      </w:r>
-      <w:proofErr w:type="spellStart"/>
-      <w:r>
-        <w:rPr>
-          <w:rFonts w:ascii="Barlow" w:hAnsi="Barlow"/>
-          <w:color w:val="auto"/>
-        </w:rPr>
-        <w:t>Installateurverzeichnis</w:t>
-      </w:r>
-      <w:proofErr w:type="spellEnd"/>
-      <w:r>
-        <w:rPr>
-          <w:rFonts w:ascii="Barlow" w:hAnsi="Barlow"/>
-          <w:color w:val="auto"/>
-        </w:rPr>
-        <w:t xml:space="preserve"> eines Netzbetreibers eingetragenes Installationsunternehmen durchgeführt (§13 Abs.2 NAV).</w:t>
+        <w:t>, oder in jedem Fall durch ein in ein Installateurverzeichnis eines Netzbetreibers eingetragenes Installationsunternehmen durchgeführt (§13 Abs.2 NAV).</w:t>
       </w:r>
     </w:p>
     <w:p>
@@ -2397,39 +2327,7 @@
           <w:rFonts w:ascii="Barlow" w:hAnsi="Barlow"/>
           <w:color w:val="auto"/>
         </w:rPr>
-        <w:t xml:space="preserve">. </w:t>
-      </w:r>
-      <w:proofErr w:type="spellStart"/>
-      <w:r>
-        <w:rPr>
-          <w:rFonts w:ascii="Barlow" w:hAnsi="Barlow"/>
-          <w:color w:val="auto"/>
-        </w:rPr>
-        <w:t>amba</w:t>
-      </w:r>
-      <w:proofErr w:type="spellEnd"/>
-      <w:r>
-        <w:rPr>
-          <w:rFonts w:ascii="Barlow" w:hAnsi="Barlow"/>
-          <w:color w:val="auto"/>
-        </w:rPr>
-        <w:t xml:space="preserve"> </w:t>
-      </w:r>
-      <w:proofErr w:type="spellStart"/>
-      <w:r>
-        <w:rPr>
-          <w:rFonts w:ascii="Barlow" w:hAnsi="Barlow"/>
-          <w:color w:val="auto"/>
-        </w:rPr>
-        <w:t>operations</w:t>
-      </w:r>
-      <w:proofErr w:type="spellEnd"/>
-      <w:r>
-        <w:rPr>
-          <w:rFonts w:ascii="Barlow" w:hAnsi="Barlow"/>
-          <w:color w:val="auto"/>
-        </w:rPr>
-        <w:t xml:space="preserve"> GmbH</w:t>
+        <w:t>. amba operations GmbH</w:t>
       </w:r>
       <w:r>
         <w:rPr>
@@ -2506,25 +2404,7 @@
           <w:color w:val="auto"/>
           <w:szCs w:val="19"/>
         </w:rPr>
-        <w:t xml:space="preserve"> hat </w:t>
-      </w:r>
-      <w:proofErr w:type="spellStart"/>
-      <w:r>
-        <w:rPr>
-          <w:rFonts w:ascii="Barlow" w:hAnsi="Barlow" w:cs="Arial"/>
-          <w:color w:val="auto"/>
-          <w:szCs w:val="19"/>
-        </w:rPr>
-        <w:t>für</w:t>
-      </w:r>
-      <w:proofErr w:type="spellEnd"/>
-      <w:r>
-        <w:rPr>
-          <w:rFonts w:ascii="Barlow" w:hAnsi="Barlow" w:cs="Arial"/>
-          <w:color w:val="auto"/>
-          <w:szCs w:val="19"/>
-        </w:rPr>
-        <w:t xml:space="preserve"> eine ausreichende Betriebshaftpflichtversicherung zu sorgen und weist diese auf Verlangen dem </w:t>
+        <w:t xml:space="preserve"> hat für eine ausreichende Betriebshaftpflichtversicherung zu sorgen und weist diese auf Verlangen dem </w:t>
       </w:r>
       <w:r>
         <w:rPr>
@@ -2784,15 +2664,13 @@
         </w:rPr>
         <w:t xml:space="preserve">Die Rechte und Pflichten aus diesem Vertrag können von </w:t>
       </w:r>
-      <w:proofErr w:type="spellStart"/>
-      <w:r>
-        <w:rPr>
-          <w:rFonts w:ascii="Barlow" w:hAnsi="Barlow"/>
-          <w:color w:val="auto"/>
-        </w:rPr>
-        <w:t>amba</w:t>
-      </w:r>
-      <w:proofErr w:type="spellEnd"/>
+      <w:r>
+        <w:rPr>
+          <w:rFonts w:ascii="Barlow" w:hAnsi="Barlow"/>
+          <w:color w:val="auto"/>
+        </w:rPr>
+        <w:t>amba operations GmbH</w:t>
+      </w:r>
       <w:r>
         <w:rPr>
           <w:rFonts w:ascii="Barlow" w:hAnsi="Barlow"/>
@@ -2800,45 +2678,13 @@
         </w:rPr>
         <w:t xml:space="preserve"> </w:t>
       </w:r>
-      <w:proofErr w:type="spellStart"/>
-      <w:r>
-        <w:rPr>
-          <w:rFonts w:ascii="Barlow" w:hAnsi="Barlow"/>
-          <w:color w:val="auto"/>
-        </w:rPr>
-        <w:t>operations</w:t>
-      </w:r>
-      <w:proofErr w:type="spellEnd"/>
-      <w:r>
-        <w:rPr>
-          <w:rFonts w:ascii="Barlow" w:hAnsi="Barlow"/>
-          <w:color w:val="auto"/>
-        </w:rPr>
-        <w:t xml:space="preserve"> GmbH</w:t>
-      </w:r>
-      <w:r>
-        <w:rPr>
-          <w:rFonts w:ascii="Barlow" w:hAnsi="Barlow"/>
-          <w:color w:val="auto"/>
-        </w:rPr>
-        <w:t xml:space="preserve"> </w:t>
-      </w:r>
-      <w:r>
-        <w:rPr>
-          <w:rFonts w:ascii="Barlow" w:hAnsi="Barlow"/>
-          <w:color w:val="auto"/>
-        </w:rPr>
-        <w:t xml:space="preserve">mit Zustimmung des Vertragspartners auf einen Dritten übertragen werden, wenn der Dritte die Gewähr dafür bietet, die Verpflichtung des Vertrages erfüllen zu können. Eine Zustimmung ist nicht erforderlich, wenn der Dritte ein verbundenes Unternehmen </w:t>
-      </w:r>
-      <w:proofErr w:type="spellStart"/>
-      <w:r>
-        <w:rPr>
-          <w:rFonts w:ascii="Barlow" w:hAnsi="Barlow"/>
-          <w:color w:val="auto"/>
-        </w:rPr>
-        <w:t>i.S.d</w:t>
-      </w:r>
-      <w:proofErr w:type="spellEnd"/>
+      <w:r>
+        <w:rPr>
+          <w:rFonts w:ascii="Barlow" w:hAnsi="Barlow"/>
+          <w:color w:val="auto"/>
+        </w:rPr>
+        <w:t>mit Zustimmung des Vertragspartners auf einen Dritten übertragen werden, wenn der Dritte die Gewähr dafür bietet, die Verpflichtung des Vertrages erfüllen zu können. Eine Zustimmung ist nicht erforderlich, wenn der Dritte ein verbundenes Unternehmen i.S.d</w:t>
+      </w:r>
       <w:r>
         <w:rPr>
           <w:rFonts w:ascii="Barlow" w:hAnsi="Barlow"/>
@@ -3828,19 +3674,8 @@
                 <w:sz w:val="12"/>
                 <w:szCs w:val="12"/>
               </w:rPr>
-              <w:t xml:space="preserve">AMBA </w:t>
+              <w:t>AMBA Operations</w:t>
             </w:r>
-            <w:proofErr w:type="spellStart"/>
-            <w:r>
-              <w:rPr>
-                <w:rFonts w:ascii="Barlow" w:hAnsi="Barlow"/>
-                <w:color w:val="auto"/>
-                <w:sz w:val="12"/>
-                <w:szCs w:val="12"/>
-              </w:rPr>
-              <w:t>Operations</w:t>
-            </w:r>
-            <w:proofErr w:type="spellEnd"/>
             <w:r>
               <w:rPr>
                 <w:rFonts w:ascii="Barlow" w:hAnsi="Barlow"/>
@@ -4702,7 +4537,7 @@
                 <w:sz w:val="19"/>
                 <w:szCs w:val="19"/>
               </w:rPr>
-              <w:t>{{STANDORT_1}}</w:t>
+              <w:t>{{STANDORT}}</w:t>
             </w:r>
           </w:p>
         </w:tc>
@@ -4729,7 +4564,7 @@
                 <w:sz w:val="19"/>
                 <w:szCs w:val="19"/>
               </w:rPr>
-              <w:t>{{ART_1}}</w:t>
+              <w:t>{{LADEEINRICHTUNG}}</w:t>
             </w:r>
           </w:p>
         </w:tc>
@@ -4797,7 +4632,7 @@
                         <w:sz w:val="19"/>
                         <w:szCs w:val="19"/>
                       </w:rPr>
-                      <w:t>{{ANZAHL_1}}</w:t>
+                      <w:t>{{LADEPUNKTE}}</w:t>
                     </w:r>
                   </w:p>
                 </w:tc>
@@ -4868,20 +4703,8 @@
           <w:szCs w:val="20"/>
           <w:u w:val="single"/>
         </w:rPr>
-        <w:t xml:space="preserve">Für Amba </w:t>
-      </w:r>
-      <w:proofErr w:type="spellStart"/>
-      <w:r>
-        <w:rPr>
-          <w:b/>
-          <w:bCs/>
-          <w:sz w:val="20"/>
-          <w:szCs w:val="20"/>
-          <w:u w:val="single"/>
-        </w:rPr>
-        <w:t>Operations</w:t>
-      </w:r>
-      <w:proofErr w:type="spellEnd"/>
+        <w:t>Für Amba Operations</w:t>
+      </w:r>
     </w:p>
     <w:p>
       <w:pPr>
@@ -4997,7 +4820,7 @@
           <w:sz w:val="20"/>
           <w:szCs w:val="20"/>
         </w:rPr>
-        <w:t>{{AP_NAME}}</w:t>
+        <w:t>{{APKFMNAME}}</w:t>
       </w:r>
     </w:p>
     <w:p>
@@ -5013,50 +4836,43 @@
           <w:sz w:val="20"/>
           <w:szCs w:val="20"/>
         </w:rPr>
-        <w:t xml:space="preserve">E-Mail: </w:t>
+        <w:t>E-Mail:</w:t>
       </w:r>
       <w:r>
         <w:rPr>
           <w:sz w:val="20"/>
           <w:szCs w:val="20"/>
         </w:rPr>
-        <w:t>{{AP_</w:t>
-      </w:r>
-      <w:r>
+        <w:t xml:space="preserve"> {{APKFMMAIL}}</w:t>
+      </w:r>
+    </w:p>
+    <w:p>
+      <w:pPr>
         <w:rPr>
           <w:sz w:val="20"/>
           <w:szCs w:val="20"/>
         </w:rPr>
-        <w:t>MAIL</w:t>
-      </w:r>
+      </w:pPr>
       <w:r>
         <w:rPr>
           <w:sz w:val="20"/>
           <w:szCs w:val="20"/>
         </w:rPr>
-        <w:t>}}</w:t>
-      </w:r>
-    </w:p>
-    <w:p>
-      <w:pPr>
+        <w:t>Tel:</w:t>
+      </w:r>
+      <w:r>
         <w:rPr>
           <w:sz w:val="20"/>
           <w:szCs w:val="20"/>
         </w:rPr>
-      </w:pPr>
+        <w:t xml:space="preserve"> </w:t>
+      </w:r>
       <w:r>
         <w:rPr>
           <w:sz w:val="20"/>
           <w:szCs w:val="20"/>
         </w:rPr>
-        <w:t xml:space="preserve">Tel: </w:t>
-      </w:r>
-      <w:r>
-        <w:rPr>
-          <w:sz w:val="20"/>
-          <w:szCs w:val="20"/>
-        </w:rPr>
-        <w:t>{{AP_TEL}}</w:t>
+        <w:t>{{APKFMTEL}}</w:t>
       </w:r>
     </w:p>
     <w:p>
@@ -5147,6 +4963,11 @@
         <w:docPartUnique/>
       </w:docPartObj>
     </w:sdtPr>
+    <w:sdtEndPr>
+      <w:rPr>
+        <w:rStyle w:val="Seitenzahl"/>
+      </w:rPr>
+    </w:sdtEndPr>
     <w:sdtContent>
       <w:p>
         <w:pPr>
@@ -5186,13 +5007,8 @@
       <w:ind w:left="-235" w:right="360" w:firstLine="0"/>
       <w:jc w:val="left"/>
     </w:pPr>
-    <w:proofErr w:type="spellStart"/>
     <w:r>
-      <w:t>Driving</w:t>
-    </w:r>
-    <w:proofErr w:type="spellEnd"/>
-    <w:r>
-      <w:t xml:space="preserve"> eMobility</w:t>
+      <w:t>Driving eMobility</w:t>
     </w:r>
     <w:r>
       <w:tab/>
@@ -5220,6 +5036,11 @@
         <w:docPartUnique/>
       </w:docPartObj>
     </w:sdtPr>
+    <w:sdtEndPr>
+      <w:rPr>
+        <w:rStyle w:val="Seitenzahl"/>
+      </w:rPr>
+    </w:sdtEndPr>
     <w:sdtContent>
       <w:p>
         <w:pPr>
@@ -5277,34 +5098,14 @@
         <w:szCs w:val="21"/>
       </w:rPr>
     </w:pPr>
-    <w:proofErr w:type="spellStart"/>
     <w:r>
       <w:rPr>
         <w:rFonts w:ascii="Barlow" w:hAnsi="Barlow"/>
         <w:sz w:val="18"/>
         <w:szCs w:val="21"/>
       </w:rPr>
-      <w:t>amba</w:t>
+      <w:t>amba operations</w:t>
     </w:r>
-    <w:proofErr w:type="spellEnd"/>
-    <w:r>
-      <w:rPr>
-        <w:rFonts w:ascii="Barlow" w:hAnsi="Barlow"/>
-        <w:sz w:val="18"/>
-        <w:szCs w:val="21"/>
-      </w:rPr>
-      <w:t xml:space="preserve"> </w:t>
-    </w:r>
-    <w:proofErr w:type="spellStart"/>
-    <w:r>
-      <w:rPr>
-        <w:rFonts w:ascii="Barlow" w:hAnsi="Barlow"/>
-        <w:sz w:val="18"/>
-        <w:szCs w:val="21"/>
-      </w:rPr>
-      <w:t>operations</w:t>
-    </w:r>
-    <w:proofErr w:type="spellEnd"/>
     <w:r>
       <w:rPr>
         <w:rFonts w:ascii="Barlow" w:hAnsi="Barlow"/>
@@ -5429,13 +5230,8 @@
       <w:ind w:left="-235" w:right="-79" w:firstLine="0"/>
       <w:jc w:val="left"/>
     </w:pPr>
-    <w:proofErr w:type="spellStart"/>
     <w:r>
-      <w:t>Driving</w:t>
-    </w:r>
-    <w:proofErr w:type="spellEnd"/>
-    <w:r>
-      <w:t xml:space="preserve"> eMobility</w:t>
+      <w:t>Driving eMobility</w:t>
     </w:r>
     <w:r>
       <w:tab/>
@@ -10929,6 +10725,7 @@
 <file path=word/glossary/settings.xml><?xml version="1.0" encoding="utf-8"?>
 <w:settings xmlns:mc="http://schemas.openxmlformats.org/markup-compatibility/2006" xmlns:o="urn:schemas-microsoft-com:office:office" xmlns:r="http://schemas.openxmlformats.org/officeDocument/2006/relationships" xmlns:m="http://schemas.openxmlformats.org/officeDocument/2006/math" xmlns:v="urn:schemas-microsoft-com:vml" xmlns:w10="urn:schemas-microsoft-com:office:word" xmlns:w="http://schemas.openxmlformats.org/wordprocessingml/2006/main" xmlns:w14="http://schemas.microsoft.com/office/word/2010/wordml" xmlns:w15="http://schemas.microsoft.com/office/word/2012/wordml" xmlns:w16cex="http://schemas.microsoft.com/office/word/2018/wordml/cex" xmlns:w16cid="http://schemas.microsoft.com/office/word/2016/wordml/cid" xmlns:w16="http://schemas.microsoft.com/office/word/2018/wordml" xmlns:w16du="http://schemas.microsoft.com/office/word/2023/wordml/word16du" xmlns:w16sdtdh="http://schemas.microsoft.com/office/word/2020/wordml/sdtdatahash" xmlns:w16sdtfl="http://schemas.microsoft.com/office/word/2024/wordml/sdtformatlock" xmlns:w16se="http://schemas.microsoft.com/office/word/2015/wordml/symex" xmlns:sl="http://schemas.openxmlformats.org/schemaLibrary/2006/main" mc:Ignorable="w14 w15 w16se w16cid w16 w16cex w16sdtdh w16sdtfl w16du">
   <w:view w:val="normal"/>
+  <w:revisionView w:inkAnnotations="0"/>
   <w:defaultTabStop w:val="708"/>
   <w:hyphenationZone w:val="425"/>
   <w:characterSpacingControl w:val="doNotCompress"/>
@@ -10948,18 +10745,23 @@
     <w:rsid w:val="00162231"/>
     <w:rsid w:val="001D62F1"/>
     <w:rsid w:val="00283D38"/>
+    <w:rsid w:val="003221BE"/>
     <w:rsid w:val="00324B4E"/>
     <w:rsid w:val="006100D4"/>
+    <w:rsid w:val="00612B12"/>
     <w:rsid w:val="00621118"/>
     <w:rsid w:val="006D442A"/>
     <w:rsid w:val="008256A6"/>
     <w:rsid w:val="008706E0"/>
     <w:rsid w:val="0093750C"/>
+    <w:rsid w:val="00A84B7D"/>
     <w:rsid w:val="00B3436C"/>
+    <w:rsid w:val="00B54527"/>
     <w:rsid w:val="00D4367A"/>
     <w:rsid w:val="00D5112F"/>
     <w:rsid w:val="00DF6745"/>
     <w:rsid w:val="00E65971"/>
+    <w:rsid w:val="00EC0431"/>
     <w:rsid w:val="00FA23FF"/>
   </w:rsids>
   <m:mathPr>
@@ -11410,422 +11212,6 @@
     <w:uiPriority w:val="99"/>
     <w:semiHidden/>
     <w:unhideWhenUsed/>
-  </w:style>
-  <w:style w:type="paragraph" w:customStyle="1" w:styleId="094E6B5006813545BE2B9A25BEF1F8D3">
-    <w:name w:val="094E6B5006813545BE2B9A25BEF1F8D3"/>
-    <w:rsid w:val="008706E0"/>
-  </w:style>
-  <w:style w:type="paragraph" w:customStyle="1" w:styleId="9C1A5340BDB87144AD5A417BBD0204C5">
-    <w:name w:val="9C1A5340BDB87144AD5A417BBD0204C5"/>
-    <w:rsid w:val="008706E0"/>
-  </w:style>
-  <w:style w:type="paragraph" w:customStyle="1" w:styleId="B15BED6C57D5384EA32238D1F941E634">
-    <w:name w:val="B15BED6C57D5384EA32238D1F941E634"/>
-    <w:rsid w:val="008706E0"/>
-  </w:style>
-  <w:style w:type="paragraph" w:customStyle="1" w:styleId="6B0E908F888C9440A0C5759738D54A4A">
-    <w:name w:val="6B0E908F888C9440A0C5759738D54A4A"/>
-    <w:rsid w:val="008706E0"/>
-  </w:style>
-  <w:style w:type="paragraph" w:customStyle="1" w:styleId="41DE2329AD5173459935A4B2FF6E40E4">
-    <w:name w:val="41DE2329AD5173459935A4B2FF6E40E4"/>
-    <w:rsid w:val="008706E0"/>
-  </w:style>
-  <w:style w:type="paragraph" w:customStyle="1" w:styleId="62DE1DAA8498F241865210691FCB4B23">
-    <w:name w:val="62DE1DAA8498F241865210691FCB4B23"/>
-    <w:rsid w:val="0093750C"/>
-  </w:style>
-  <w:style w:type="paragraph" w:customStyle="1" w:styleId="E7C3701566DCCE499ACD64602CDCE643">
-    <w:name w:val="E7C3701566DCCE499ACD64602CDCE643"/>
-    <w:rsid w:val="0093750C"/>
-  </w:style>
-  <w:style w:type="paragraph" w:customStyle="1" w:styleId="4268ED28C7010344AF1BB28C1B368E43">
-    <w:name w:val="4268ED28C7010344AF1BB28C1B368E43"/>
-    <w:rsid w:val="0093750C"/>
-  </w:style>
-  <w:style w:type="paragraph" w:customStyle="1" w:styleId="3C595937DAA16147BE768BD76E9966B6">
-    <w:name w:val="3C595937DAA16147BE768BD76E9966B6"/>
-    <w:rsid w:val="0093750C"/>
-  </w:style>
-  <w:style w:type="paragraph" w:customStyle="1" w:styleId="F6418AA001E665428107ECDD41B84657">
-    <w:name w:val="F6418AA001E665428107ECDD41B84657"/>
-    <w:rsid w:val="0093750C"/>
-  </w:style>
-  <w:style w:type="paragraph" w:customStyle="1" w:styleId="ECD7494419D4344496AC5329C3F9D317">
-    <w:name w:val="ECD7494419D4344496AC5329C3F9D317"/>
-    <w:rsid w:val="0093750C"/>
-  </w:style>
-  <w:style w:type="paragraph" w:customStyle="1" w:styleId="F64B9F2BD94B064797B1745562F158C2">
-    <w:name w:val="F64B9F2BD94B064797B1745562F158C2"/>
-    <w:rsid w:val="0093750C"/>
-  </w:style>
-  <w:style w:type="paragraph" w:customStyle="1" w:styleId="A24478646D8B0445A262C4623EB1BBFA">
-    <w:name w:val="A24478646D8B0445A262C4623EB1BBFA"/>
-    <w:rsid w:val="0093750C"/>
-  </w:style>
-  <w:style w:type="paragraph" w:customStyle="1" w:styleId="24E9250F70C3814EB07C24A1C34EA675">
-    <w:name w:val="24E9250F70C3814EB07C24A1C34EA675"/>
-    <w:rsid w:val="0093750C"/>
-  </w:style>
-  <w:style w:type="paragraph" w:customStyle="1" w:styleId="DA16E2F142BB59458F8D86081ADC8F0D">
-    <w:name w:val="DA16E2F142BB59458F8D86081ADC8F0D"/>
-    <w:rsid w:val="0093750C"/>
-  </w:style>
-  <w:style w:type="paragraph" w:customStyle="1" w:styleId="9E0C1EA59DFAEF47963479FA1550759A">
-    <w:name w:val="9E0C1EA59DFAEF47963479FA1550759A"/>
-    <w:rsid w:val="0093750C"/>
-  </w:style>
-  <w:style w:type="paragraph" w:customStyle="1" w:styleId="8772310BDDA71E409292A74C661E87C0">
-    <w:name w:val="8772310BDDA71E409292A74C661E87C0"/>
-    <w:rsid w:val="0093750C"/>
-  </w:style>
-  <w:style w:type="paragraph" w:customStyle="1" w:styleId="FE06545CC9429B42A32BD875FBC6845C">
-    <w:name w:val="FE06545CC9429B42A32BD875FBC6845C"/>
-    <w:rsid w:val="0093750C"/>
-  </w:style>
-  <w:style w:type="paragraph" w:customStyle="1" w:styleId="5DE97A018C83794F8594BBCA62432DAF">
-    <w:name w:val="5DE97A018C83794F8594BBCA62432DAF"/>
-    <w:rsid w:val="0093750C"/>
-  </w:style>
-  <w:style w:type="paragraph" w:customStyle="1" w:styleId="8DE81150F639394C984DCC8060828D5D">
-    <w:name w:val="8DE81150F639394C984DCC8060828D5D"/>
-    <w:rsid w:val="0093750C"/>
-  </w:style>
-  <w:style w:type="paragraph" w:customStyle="1" w:styleId="BB9F04AFCDCB3D4CB0879676DDFDC252">
-    <w:name w:val="BB9F04AFCDCB3D4CB0879676DDFDC252"/>
-    <w:rsid w:val="0093750C"/>
-  </w:style>
-  <w:style w:type="paragraph" w:customStyle="1" w:styleId="BA3F55EA11DDDD42A750079E6C13505B">
-    <w:name w:val="BA3F55EA11DDDD42A750079E6C13505B"/>
-    <w:rsid w:val="0093750C"/>
-  </w:style>
-  <w:style w:type="paragraph" w:customStyle="1" w:styleId="6F42DC0281C00C4A89005C155302AD0B">
-    <w:name w:val="6F42DC0281C00C4A89005C155302AD0B"/>
-    <w:rsid w:val="0093750C"/>
-  </w:style>
-  <w:style w:type="paragraph" w:customStyle="1" w:styleId="9E96759D06B2E34F8CC7038F38EE1109">
-    <w:name w:val="9E96759D06B2E34F8CC7038F38EE1109"/>
-    <w:rsid w:val="0093750C"/>
-  </w:style>
-  <w:style w:type="paragraph" w:customStyle="1" w:styleId="697995E7F71EAD44AD7736DD65212B33">
-    <w:name w:val="697995E7F71EAD44AD7736DD65212B33"/>
-    <w:rsid w:val="0093750C"/>
-  </w:style>
-  <w:style w:type="paragraph" w:customStyle="1" w:styleId="D818C36BEEAB034D8908D0B27960527F">
-    <w:name w:val="D818C36BEEAB034D8908D0B27960527F"/>
-    <w:rsid w:val="0093750C"/>
-  </w:style>
-  <w:style w:type="paragraph" w:customStyle="1" w:styleId="59CB7B0428A50E4AAFD71DA814F75B9E">
-    <w:name w:val="59CB7B0428A50E4AAFD71DA814F75B9E"/>
-    <w:rsid w:val="0093750C"/>
-  </w:style>
-  <w:style w:type="paragraph" w:customStyle="1" w:styleId="699E5B0944B4A1468B9D8E760B9C8444">
-    <w:name w:val="699E5B0944B4A1468B9D8E760B9C8444"/>
-    <w:rsid w:val="0093750C"/>
-  </w:style>
-  <w:style w:type="paragraph" w:customStyle="1" w:styleId="307B37DE5F47B5429BDB3D8EB5649225">
-    <w:name w:val="307B37DE5F47B5429BDB3D8EB5649225"/>
-    <w:rsid w:val="0093750C"/>
-  </w:style>
-  <w:style w:type="paragraph" w:customStyle="1" w:styleId="42D9EB151506F5459C9BDAB79AC297D5">
-    <w:name w:val="42D9EB151506F5459C9BDAB79AC297D5"/>
-    <w:rsid w:val="0093750C"/>
-  </w:style>
-  <w:style w:type="paragraph" w:customStyle="1" w:styleId="6FCD07F30B9D8B4AA7EF9A9DE51F11E8">
-    <w:name w:val="6FCD07F30B9D8B4AA7EF9A9DE51F11E8"/>
-    <w:rsid w:val="0093750C"/>
-  </w:style>
-  <w:style w:type="paragraph" w:customStyle="1" w:styleId="58A305D0FC32964A90E1B4D1E4AED904">
-    <w:name w:val="58A305D0FC32964A90E1B4D1E4AED904"/>
-    <w:rsid w:val="0093750C"/>
-  </w:style>
-  <w:style w:type="paragraph" w:customStyle="1" w:styleId="3A858BC4EA4F5E42872FA1E14CB66A1E">
-    <w:name w:val="3A858BC4EA4F5E42872FA1E14CB66A1E"/>
-    <w:rsid w:val="0093750C"/>
-  </w:style>
-  <w:style w:type="paragraph" w:customStyle="1" w:styleId="6C525343D4351E48A3B4BA9E4AAFC601">
-    <w:name w:val="6C525343D4351E48A3B4BA9E4AAFC601"/>
-    <w:rsid w:val="0093750C"/>
-  </w:style>
-  <w:style w:type="paragraph" w:customStyle="1" w:styleId="160F905FB754CA47BE23004CDB6AA6E9">
-    <w:name w:val="160F905FB754CA47BE23004CDB6AA6E9"/>
-    <w:rsid w:val="0093750C"/>
-  </w:style>
-  <w:style w:type="paragraph" w:customStyle="1" w:styleId="13764B4889BA3543BF926CA41140A408">
-    <w:name w:val="13764B4889BA3543BF926CA41140A408"/>
-    <w:rsid w:val="0093750C"/>
-  </w:style>
-  <w:style w:type="paragraph" w:customStyle="1" w:styleId="67BF68D4EA3C344EA1CF488F5EA35148">
-    <w:name w:val="67BF68D4EA3C344EA1CF488F5EA35148"/>
-    <w:rsid w:val="0093750C"/>
-  </w:style>
-  <w:style w:type="paragraph" w:customStyle="1" w:styleId="A30CABF923DC834E8D20B010A421A31C">
-    <w:name w:val="A30CABF923DC834E8D20B010A421A31C"/>
-    <w:rsid w:val="0093750C"/>
-  </w:style>
-  <w:style w:type="paragraph" w:customStyle="1" w:styleId="2FC10B0008AF4942B42EA186C8D0E942">
-    <w:name w:val="2FC10B0008AF4942B42EA186C8D0E942"/>
-    <w:rsid w:val="0093750C"/>
-  </w:style>
-  <w:style w:type="paragraph" w:customStyle="1" w:styleId="23EACAB259C44F4DACDDEA7B2C1FA792">
-    <w:name w:val="23EACAB259C44F4DACDDEA7B2C1FA792"/>
-    <w:rsid w:val="0093750C"/>
-  </w:style>
-  <w:style w:type="paragraph" w:customStyle="1" w:styleId="025D9D72802D48958AE593F2C9F08ECE">
-    <w:name w:val="025D9D72802D48958AE593F2C9F08ECE"/>
-    <w:rsid w:val="001D62F1"/>
-  </w:style>
-  <w:style w:type="paragraph" w:customStyle="1" w:styleId="EBA0833C728241628177ADF78A8931D3">
-    <w:name w:val="EBA0833C728241628177ADF78A8931D3"/>
-    <w:rsid w:val="001D62F1"/>
-  </w:style>
-  <w:style w:type="paragraph" w:customStyle="1" w:styleId="8B1880941B784C69A5839ECFC253F138">
-    <w:name w:val="8B1880941B784C69A5839ECFC253F138"/>
-    <w:rsid w:val="001D62F1"/>
-  </w:style>
-  <w:style w:type="paragraph" w:customStyle="1" w:styleId="42F94CF55364424C854560B5C57B8DB0">
-    <w:name w:val="42F94CF55364424C854560B5C57B8DB0"/>
-    <w:rsid w:val="001D62F1"/>
-  </w:style>
-  <w:style w:type="paragraph" w:customStyle="1" w:styleId="014670635D3E45778ACD8CE79E6AE4B8">
-    <w:name w:val="014670635D3E45778ACD8CE79E6AE4B8"/>
-    <w:rsid w:val="001D62F1"/>
-  </w:style>
-  <w:style w:type="paragraph" w:customStyle="1" w:styleId="C706CABE64A444EAAD5AB36EA3C2E0F9">
-    <w:name w:val="C706CABE64A444EAAD5AB36EA3C2E0F9"/>
-    <w:rsid w:val="001D62F1"/>
-  </w:style>
-  <w:style w:type="paragraph" w:customStyle="1" w:styleId="06C78EA913334CDEA1F045D89EDF043C">
-    <w:name w:val="06C78EA913334CDEA1F045D89EDF043C"/>
-    <w:rsid w:val="001D62F1"/>
-  </w:style>
-  <w:style w:type="paragraph" w:customStyle="1" w:styleId="AB348416804946E2ACEF8CAC005CD63A">
-    <w:name w:val="AB348416804946E2ACEF8CAC005CD63A"/>
-    <w:rsid w:val="001D62F1"/>
-  </w:style>
-  <w:style w:type="paragraph" w:customStyle="1" w:styleId="EE94D5FF2ADE416FA0B10677F027626B">
-    <w:name w:val="EE94D5FF2ADE416FA0B10677F027626B"/>
-    <w:rsid w:val="001D62F1"/>
-  </w:style>
-  <w:style w:type="paragraph" w:customStyle="1" w:styleId="F24A59AD0F4A4C81BFEF3A1E54179D0A">
-    <w:name w:val="F24A59AD0F4A4C81BFEF3A1E54179D0A"/>
-    <w:rsid w:val="001D62F1"/>
-  </w:style>
-  <w:style w:type="paragraph" w:customStyle="1" w:styleId="1F61B36D0B4F49B1AA2FCA45DF151970">
-    <w:name w:val="1F61B36D0B4F49B1AA2FCA45DF151970"/>
-    <w:rsid w:val="001D62F1"/>
-  </w:style>
-  <w:style w:type="paragraph" w:customStyle="1" w:styleId="FE5D535701AB4E76B5E979E268A1CBF0">
-    <w:name w:val="FE5D535701AB4E76B5E979E268A1CBF0"/>
-    <w:rsid w:val="001D62F1"/>
-  </w:style>
-  <w:style w:type="paragraph" w:customStyle="1" w:styleId="B5D50FEEE96244F589B3A9988A65C699">
-    <w:name w:val="B5D50FEEE96244F589B3A9988A65C699"/>
-    <w:rsid w:val="001D62F1"/>
-  </w:style>
-  <w:style w:type="paragraph" w:customStyle="1" w:styleId="10A7DB27DC24478686FD81BCD4277902">
-    <w:name w:val="10A7DB27DC24478686FD81BCD4277902"/>
-    <w:rsid w:val="001D62F1"/>
-  </w:style>
-  <w:style w:type="paragraph" w:customStyle="1" w:styleId="9B7A3D147D54474AB323457E7FF3041C">
-    <w:name w:val="9B7A3D147D54474AB323457E7FF3041C"/>
-    <w:rsid w:val="001D62F1"/>
-  </w:style>
-  <w:style w:type="paragraph" w:customStyle="1" w:styleId="7D854E570D854988AC78E6538EF73E64">
-    <w:name w:val="7D854E570D854988AC78E6538EF73E64"/>
-    <w:rsid w:val="001D62F1"/>
-  </w:style>
-  <w:style w:type="paragraph" w:customStyle="1" w:styleId="F10F9DECDF6A4B7BA5B657B95C486147">
-    <w:name w:val="F10F9DECDF6A4B7BA5B657B95C486147"/>
-    <w:rsid w:val="001D62F1"/>
-  </w:style>
-  <w:style w:type="paragraph" w:customStyle="1" w:styleId="41BFB1F4187B417BB38A1C4509669CE1">
-    <w:name w:val="41BFB1F4187B417BB38A1C4509669CE1"/>
-    <w:rsid w:val="001D62F1"/>
-  </w:style>
-  <w:style w:type="paragraph" w:customStyle="1" w:styleId="2F0BA0ADCF5B4BC2BEF4CC1351033819">
-    <w:name w:val="2F0BA0ADCF5B4BC2BEF4CC1351033819"/>
-    <w:rsid w:val="001D62F1"/>
-  </w:style>
-  <w:style w:type="paragraph" w:customStyle="1" w:styleId="B28AD995D45E4C8EA763E719E5321F43">
-    <w:name w:val="B28AD995D45E4C8EA763E719E5321F43"/>
-    <w:rsid w:val="001D62F1"/>
-  </w:style>
-  <w:style w:type="paragraph" w:customStyle="1" w:styleId="76F9031F0FE643D9AA609A75A55F02F5">
-    <w:name w:val="76F9031F0FE643D9AA609A75A55F02F5"/>
-    <w:rsid w:val="001D62F1"/>
-  </w:style>
-  <w:style w:type="paragraph" w:customStyle="1" w:styleId="555BA9CEEF3D4551B53E6AE44F6F4807">
-    <w:name w:val="555BA9CEEF3D4551B53E6AE44F6F4807"/>
-    <w:rsid w:val="001D62F1"/>
-  </w:style>
-  <w:style w:type="paragraph" w:customStyle="1" w:styleId="D6AA3B321BAE429AB33E6C7DE0BCAAE5">
-    <w:name w:val="D6AA3B321BAE429AB33E6C7DE0BCAAE5"/>
-    <w:rsid w:val="001D62F1"/>
-  </w:style>
-  <w:style w:type="paragraph" w:customStyle="1" w:styleId="4A8ADC0E771C4D6188AD748D5F363849">
-    <w:name w:val="4A8ADC0E771C4D6188AD748D5F363849"/>
-    <w:rsid w:val="001D62F1"/>
-  </w:style>
-  <w:style w:type="paragraph" w:customStyle="1" w:styleId="E77FA9672828473A9EFE2F3DA8133D1D">
-    <w:name w:val="E77FA9672828473A9EFE2F3DA8133D1D"/>
-    <w:rsid w:val="001D62F1"/>
-  </w:style>
-  <w:style w:type="paragraph" w:customStyle="1" w:styleId="B298B4BDAFF5419E83C39CE7493D7D57">
-    <w:name w:val="B298B4BDAFF5419E83C39CE7493D7D57"/>
-    <w:rsid w:val="001D62F1"/>
-  </w:style>
-  <w:style w:type="paragraph" w:customStyle="1" w:styleId="737AF4E22D824702AEA00124F6EED47A">
-    <w:name w:val="737AF4E22D824702AEA00124F6EED47A"/>
-    <w:rsid w:val="001D62F1"/>
-  </w:style>
-  <w:style w:type="paragraph" w:customStyle="1" w:styleId="FA447CC2FAAA4A9782355619416A2EEE">
-    <w:name w:val="FA447CC2FAAA4A9782355619416A2EEE"/>
-    <w:rsid w:val="001D62F1"/>
-  </w:style>
-  <w:style w:type="paragraph" w:customStyle="1" w:styleId="1F1CADB07D3C46709BA59D8E8AE76B9C">
-    <w:name w:val="1F1CADB07D3C46709BA59D8E8AE76B9C"/>
-    <w:rsid w:val="001D62F1"/>
-  </w:style>
-  <w:style w:type="paragraph" w:customStyle="1" w:styleId="168DFC940713463385BB442B053E0541">
-    <w:name w:val="168DFC940713463385BB442B053E0541"/>
-    <w:rsid w:val="001D62F1"/>
-  </w:style>
-  <w:style w:type="paragraph" w:customStyle="1" w:styleId="9F08FA4BA26E4CCBAF76F370B5220E76">
-    <w:name w:val="9F08FA4BA26E4CCBAF76F370B5220E76"/>
-    <w:rsid w:val="001D62F1"/>
-  </w:style>
-  <w:style w:type="paragraph" w:customStyle="1" w:styleId="6888DCCDB8EF4B019A50729256CB5079">
-    <w:name w:val="6888DCCDB8EF4B019A50729256CB5079"/>
-    <w:rsid w:val="001D62F1"/>
-  </w:style>
-  <w:style w:type="paragraph" w:customStyle="1" w:styleId="23C788D00384492D89F702CD76E23A02">
-    <w:name w:val="23C788D00384492D89F702CD76E23A02"/>
-    <w:rsid w:val="001D62F1"/>
-  </w:style>
-  <w:style w:type="paragraph" w:customStyle="1" w:styleId="702A2FAEDA7E4501A020018F4082A265">
-    <w:name w:val="702A2FAEDA7E4501A020018F4082A265"/>
-    <w:rsid w:val="001D62F1"/>
-  </w:style>
-  <w:style w:type="paragraph" w:customStyle="1" w:styleId="0A4717EBF46A4EACBA3C1E0EBE0FA89E">
-    <w:name w:val="0A4717EBF46A4EACBA3C1E0EBE0FA89E"/>
-    <w:rsid w:val="001D62F1"/>
-  </w:style>
-  <w:style w:type="paragraph" w:customStyle="1" w:styleId="42A1F29B05794FC1A0855D6A80E3D50B">
-    <w:name w:val="42A1F29B05794FC1A0855D6A80E3D50B"/>
-    <w:rsid w:val="001D62F1"/>
-  </w:style>
-  <w:style w:type="paragraph" w:customStyle="1" w:styleId="26FA207BAD204960B67A5C3AFB390FFF">
-    <w:name w:val="26FA207BAD204960B67A5C3AFB390FFF"/>
-    <w:rsid w:val="001D62F1"/>
-  </w:style>
-  <w:style w:type="paragraph" w:customStyle="1" w:styleId="8CE3E2D908384721B83F18B6D88B1E3D">
-    <w:name w:val="8CE3E2D908384721B83F18B6D88B1E3D"/>
-    <w:rsid w:val="001D62F1"/>
-  </w:style>
-  <w:style w:type="paragraph" w:customStyle="1" w:styleId="DF91831B0FA44935A0AB010AAC49D447">
-    <w:name w:val="DF91831B0FA44935A0AB010AAC49D447"/>
-    <w:rsid w:val="001D62F1"/>
-  </w:style>
-  <w:style w:type="paragraph" w:customStyle="1" w:styleId="D9B3339D65B04604B0B533B118DAABAD">
-    <w:name w:val="D9B3339D65B04604B0B533B118DAABAD"/>
-    <w:rsid w:val="001D62F1"/>
-  </w:style>
-  <w:style w:type="paragraph" w:customStyle="1" w:styleId="A9D9CD572D744A01920F5B94CEC2935C">
-    <w:name w:val="A9D9CD572D744A01920F5B94CEC2935C"/>
-    <w:rsid w:val="001D62F1"/>
-  </w:style>
-  <w:style w:type="paragraph" w:customStyle="1" w:styleId="003B5489F8954D96AD2012A8D904D498">
-    <w:name w:val="003B5489F8954D96AD2012A8D904D498"/>
-    <w:rsid w:val="001D62F1"/>
-  </w:style>
-  <w:style w:type="paragraph" w:customStyle="1" w:styleId="09DA9ED38EF94F94AE57BD142C74C8B8">
-    <w:name w:val="09DA9ED38EF94F94AE57BD142C74C8B8"/>
-    <w:rsid w:val="001D62F1"/>
-  </w:style>
-  <w:style w:type="paragraph" w:customStyle="1" w:styleId="51B141CE5F784A60905549B8877DCD23">
-    <w:name w:val="51B141CE5F784A60905549B8877DCD23"/>
-    <w:rsid w:val="001D62F1"/>
-  </w:style>
-  <w:style w:type="paragraph" w:customStyle="1" w:styleId="753F65943D4D42FF84B917C6B64CA8B2">
-    <w:name w:val="753F65943D4D42FF84B917C6B64CA8B2"/>
-    <w:rsid w:val="001D62F1"/>
-  </w:style>
-  <w:style w:type="paragraph" w:customStyle="1" w:styleId="ACF3262B9603423FBEEACF1041BCC6DC">
-    <w:name w:val="ACF3262B9603423FBEEACF1041BCC6DC"/>
-    <w:rsid w:val="001D62F1"/>
-  </w:style>
-  <w:style w:type="paragraph" w:customStyle="1" w:styleId="50BD882FCB9843FEAD6A515CC2E819DC">
-    <w:name w:val="50BD882FCB9843FEAD6A515CC2E819DC"/>
-    <w:rsid w:val="001D62F1"/>
-  </w:style>
-  <w:style w:type="paragraph" w:customStyle="1" w:styleId="3CDDE7076E14465EBFD0BB3AB632AD95">
-    <w:name w:val="3CDDE7076E14465EBFD0BB3AB632AD95"/>
-    <w:rsid w:val="001D62F1"/>
-  </w:style>
-  <w:style w:type="paragraph" w:customStyle="1" w:styleId="C2F206C291DE4564AE23135004ECFCD3">
-    <w:name w:val="C2F206C291DE4564AE23135004ECFCD3"/>
-    <w:rsid w:val="001D62F1"/>
-  </w:style>
-  <w:style w:type="paragraph" w:customStyle="1" w:styleId="A92486B0274D4049A6AD7A2E06620095">
-    <w:name w:val="A92486B0274D4049A6AD7A2E06620095"/>
-    <w:rsid w:val="001D62F1"/>
-  </w:style>
-  <w:style w:type="paragraph" w:customStyle="1" w:styleId="355121F5985C48D9AF3AB6D162DF81C9">
-    <w:name w:val="355121F5985C48D9AF3AB6D162DF81C9"/>
-    <w:rsid w:val="001D62F1"/>
-  </w:style>
-  <w:style w:type="paragraph" w:customStyle="1" w:styleId="9D2B505F6E6049EEAC5A180DED4687AF">
-    <w:name w:val="9D2B505F6E6049EEAC5A180DED4687AF"/>
-    <w:rsid w:val="001D62F1"/>
-  </w:style>
-  <w:style w:type="paragraph" w:customStyle="1" w:styleId="4173E5C0116C43D29C555A2EF3CEF217">
-    <w:name w:val="4173E5C0116C43D29C555A2EF3CEF217"/>
-    <w:rsid w:val="001D62F1"/>
-  </w:style>
-  <w:style w:type="paragraph" w:customStyle="1" w:styleId="4A5CB55C01DD4E7FBDD5BF73DAB2FCF9">
-    <w:name w:val="4A5CB55C01DD4E7FBDD5BF73DAB2FCF9"/>
-    <w:rsid w:val="001D62F1"/>
-  </w:style>
-  <w:style w:type="paragraph" w:customStyle="1" w:styleId="757343FFD22F471AABB12A5853823E7C">
-    <w:name w:val="757343FFD22F471AABB12A5853823E7C"/>
-    <w:rsid w:val="001D62F1"/>
-  </w:style>
-  <w:style w:type="paragraph" w:customStyle="1" w:styleId="6266AA35548449A8B51F3CC1D11FE08E">
-    <w:name w:val="6266AA35548449A8B51F3CC1D11FE08E"/>
-    <w:rsid w:val="001D62F1"/>
-  </w:style>
-  <w:style w:type="paragraph" w:customStyle="1" w:styleId="4E4FCAD00A614798A8A77BBBC2F21741">
-    <w:name w:val="4E4FCAD00A614798A8A77BBBC2F21741"/>
-    <w:rsid w:val="001D62F1"/>
-  </w:style>
-  <w:style w:type="paragraph" w:customStyle="1" w:styleId="718965C288E1496695B559560FC0D973">
-    <w:name w:val="718965C288E1496695B559560FC0D973"/>
-    <w:rsid w:val="001D62F1"/>
-  </w:style>
-  <w:style w:type="paragraph" w:customStyle="1" w:styleId="D83BCE69C7374BC9A367F82B76C9BA1C">
-    <w:name w:val="D83BCE69C7374BC9A367F82B76C9BA1C"/>
-    <w:rsid w:val="001D62F1"/>
-  </w:style>
-  <w:style w:type="paragraph" w:customStyle="1" w:styleId="815F6A3705354BA7A338B41A46CBA7EA">
-    <w:name w:val="815F6A3705354BA7A338B41A46CBA7EA"/>
-    <w:rsid w:val="001D62F1"/>
-  </w:style>
-  <w:style w:type="paragraph" w:customStyle="1" w:styleId="29E1E16056CC421EB40C5F06FC15385E">
-    <w:name w:val="29E1E16056CC421EB40C5F06FC15385E"/>
-    <w:rsid w:val="001D62F1"/>
-  </w:style>
-  <w:style w:type="paragraph" w:customStyle="1" w:styleId="D84890503A8E45A69239ECAF480C84F2">
-    <w:name w:val="D84890503A8E45A69239ECAF480C84F2"/>
-    <w:rsid w:val="001D62F1"/>
-  </w:style>
-  <w:style w:type="paragraph" w:customStyle="1" w:styleId="F9DB011A259F46868BA8D515C9FF2ED6">
-    <w:name w:val="F9DB011A259F46868BA8D515C9FF2ED6"/>
-    <w:rsid w:val="001D62F1"/>
-  </w:style>
-  <w:style w:type="paragraph" w:customStyle="1" w:styleId="DDE56A61EF5A4E7CAF6A6C5970CD082E">
-    <w:name w:val="DDE56A61EF5A4E7CAF6A6C5970CD082E"/>
-    <w:rsid w:val="001D62F1"/>
   </w:style>
   <w:style w:type="paragraph" w:customStyle="1" w:styleId="41DBE829470F44A4BFDE107EDE6EB2AC">
     <w:name w:val="41DBE829470F44A4BFDE107EDE6EB2AC"/>

</xml_diff>